<commit_message>
Remove inherited title rule and verify completed CSPG4 draft artifacts
</commit_message>
<xml_diff>
--- a/research/release-candidates/cspg4-broad-20260919/journal-package/CSPG4-cover-letter.docx
+++ b/research/release-candidates/cspg4-broad-20260919/journal-package/CSPG4-cover-letter.docx
@@ -842,9 +842,6 @@
     <w:rsid w:val="00FC693F"/>
     <w:pPr>
       <w:keepNext/>
-      <w:pBdr>
-        <w:bottom w:val="single" w:sz="8" w:space="4" w:color="4F81BD" w:themeColor="accent1"/>
-      </w:pBdr>
       <w:spacing w:after="140" w:line="240" w:lineRule="auto" w:before="0"/>
       <w:contextualSpacing/>
     </w:pPr>
@@ -1330,9 +1327,6 @@
     <w:qFormat/>
     <w:rsid w:val="00FC693F"/>
     <w:pPr>
-      <w:pBdr>
-        <w:bottom w:val="single" w:sz="4" w:space="4" w:color="4F81BD" w:themeColor="accent1"/>
-      </w:pBdr>
       <w:spacing w:before="200" w:after="280"/>
       <w:ind w:left="936" w:right="936"/>
     </w:pPr>

</xml_diff>